<commit_message>
Tweaks for reputation display.
</commit_message>
<xml_diff>
--- a/doc/tekfive/NV059/proposal/TekFive_AutonomousTrust_DON26BZ03-NV059_Technical_Volume_2.docx
+++ b/doc/tekfive/NV059/proposal/TekFive_AutonomousTrust_DON26BZ03-NV059_Technical_Volume_2.docx
@@ -1077,7 +1077,7 @@
                 <w:szCs w:val="20"/>
                 <w:lang w:val="en-US" w:eastAsia="en-US" w:bidi="ar-SA"/>
               </w:rPr>
-              <w:t>e-enrollment frequency modeled at ≤ N per node-year</w:t>
+              <w:t>e-enrollment frequency modeled at ≤ N per node-year.</w:t>
             </w:r>
           </w:p>
         </w:tc>
@@ -3852,6 +3852,176 @@
           </w:p>
         </w:tc>
       </w:tr>
+      <w:tr>
+        <w:trPr/>
+        <w:tc>
+          <w:tcPr>
+            <w:tcW w:w="1615" w:type="dxa"/>
+            <w:tcBorders/>
+          </w:tcPr>
+          <w:p>
+            <w:pPr>
+              <w:pStyle w:val="Normal"/>
+              <w:widowControl w:val="false"/>
+              <w:ind w:hanging="0"/>
+              <w:jc w:val="left"/>
+              <w:rPr>
+                <w:sz w:val="20"/>
+                <w:szCs w:val="20"/>
+              </w:rPr>
+            </w:pPr>
+            <w:r>
+              <w:rPr>
+                <w:sz w:val="20"/>
+                <w:szCs w:val="20"/>
+              </w:rPr>
+              <w:t>J. Mark Norris</w:t>
+            </w:r>
+          </w:p>
+          <w:p>
+            <w:pPr>
+              <w:pStyle w:val="Normal"/>
+              <w:widowControl w:val="false"/>
+              <w:ind w:hanging="0"/>
+              <w:jc w:val="left"/>
+              <w:rPr>
+                <w:sz w:val="20"/>
+                <w:szCs w:val="20"/>
+              </w:rPr>
+            </w:pPr>
+            <w:r>
+              <w:rPr>
+                <w:sz w:val="20"/>
+                <w:szCs w:val="20"/>
+              </w:rPr>
+              <w:t>Senior Principal Systems Engineer</w:t>
+            </w:r>
+          </w:p>
+          <w:p>
+            <w:pPr>
+              <w:pStyle w:val="Normal"/>
+              <w:widowControl w:val="false"/>
+              <w:spacing w:before="0" w:after="120"/>
+              <w:ind w:hanging="0"/>
+              <w:jc w:val="left"/>
+              <w:rPr>
+                <w:sz w:val="20"/>
+                <w:szCs w:val="20"/>
+              </w:rPr>
+            </w:pPr>
+            <w:r>
+              <w:rPr>
+                <w:sz w:val="20"/>
+                <w:szCs w:val="20"/>
+              </w:rPr>
+              <w:t>Zero Trust Architecture Lead</w:t>
+            </w:r>
+          </w:p>
+        </w:tc>
+        <w:tc>
+          <w:tcPr>
+            <w:tcW w:w="1099" w:type="dxa"/>
+            <w:tcBorders/>
+          </w:tcPr>
+          <w:p>
+            <w:pPr>
+              <w:pStyle w:val="Normal"/>
+              <w:widowControl w:val="false"/>
+              <w:spacing w:before="0" w:after="120"/>
+              <w:ind w:hanging="0"/>
+              <w:jc w:val="center"/>
+              <w:rPr>
+                <w:sz w:val="20"/>
+                <w:szCs w:val="20"/>
+              </w:rPr>
+            </w:pPr>
+            <w:r>
+              <w:rPr>
+                <w:sz w:val="20"/>
+                <w:szCs w:val="20"/>
+              </w:rPr>
+              <w:t>TekFive</w:t>
+            </w:r>
+          </w:p>
+        </w:tc>
+        <w:tc>
+          <w:tcPr>
+            <w:tcW w:w="3226" w:type="dxa"/>
+            <w:tcBorders/>
+          </w:tcPr>
+          <w:p>
+            <w:pPr>
+              <w:pStyle w:val="Normal"/>
+              <w:widowControl w:val="false"/>
+              <w:spacing w:before="0" w:after="120"/>
+              <w:ind w:hanging="0"/>
+              <w:jc w:val="left"/>
+              <w:rPr>
+                <w:sz w:val="20"/>
+                <w:szCs w:val="20"/>
+              </w:rPr>
+            </w:pPr>
+            <w:r>
+              <w:rPr>
+                <w:sz w:val="20"/>
+                <w:szCs w:val="20"/>
+              </w:rPr>
+              <w:t>40+ years enterprise/systems architecture and networking; NASA enterprise zero trust architecture (ZTA), network access control, device identity, and closed-network security; requirements development and traceability, engineering design packages, and program management.</w:t>
+            </w:r>
+          </w:p>
+        </w:tc>
+        <w:tc>
+          <w:tcPr>
+            <w:tcW w:w="984" w:type="dxa"/>
+            <w:tcBorders/>
+          </w:tcPr>
+          <w:p>
+            <w:pPr>
+              <w:pStyle w:val="Normal"/>
+              <w:widowControl w:val="false"/>
+              <w:spacing w:before="0" w:after="120"/>
+              <w:ind w:hanging="0"/>
+              <w:jc w:val="center"/>
+              <w:rPr>
+                <w:sz w:val="20"/>
+                <w:szCs w:val="20"/>
+              </w:rPr>
+            </w:pPr>
+            <w:r>
+              <w:rPr>
+                <w:sz w:val="20"/>
+                <w:szCs w:val="20"/>
+              </w:rPr>
+              <w:t>N</w:t>
+            </w:r>
+          </w:p>
+        </w:tc>
+        <w:tc>
+          <w:tcPr>
+            <w:tcW w:w="2526" w:type="dxa"/>
+            <w:tcBorders/>
+          </w:tcPr>
+          <w:p>
+            <w:pPr>
+              <w:pStyle w:val="Normal"/>
+              <w:widowControl w:val="false"/>
+              <w:spacing w:before="0" w:after="120"/>
+              <w:jc w:val="left"/>
+              <w:rPr>
+                <w:sz w:val="20"/>
+                <w:szCs w:val="20"/>
+              </w:rPr>
+            </w:pPr>
+            <w:r>
+              <w:rPr>
+                <w:sz w:val="20"/>
+                <w:szCs w:val="20"/>
+              </w:rPr>
+              <w:t>—</w:t>
+            </w:r>
+          </w:p>
+        </w:tc>
+      </w:tr>
     </w:tbl>
     <w:p>
       <w:pPr>
@@ -4128,7 +4298,7 @@
       </w:pPr>
       <w:r>
         <w:rPr>
-          <w:rFonts w:cs="Times New Roman" w:ascii="Times New Roman" w:hAnsi="Times New Roman"/>
+          <w:rFonts w:cs="Times New Roman"/>
           <w:b w:val="false"/>
           <w:i w:val="false"/>
           <w:color w:val="000000"/>
@@ -4291,7 +4461,7 @@
           <w:b/>
           <w:i w:val="false"/>
           <w:color w:val="auto"/>
-          <w:sz w:val="28"/>
+          <w:sz w:val="24"/>
           <w:szCs w:val="28"/>
           <w:lang w:val="en-US" w:eastAsia="en-US" w:bidi="ar-SA"/>
         </w:rPr>
@@ -4302,13 +4472,17 @@
       <w:pPr>
         <w:pStyle w:val="Normal"/>
         <w:spacing w:before="0" w:after="0"/>
-        <w:rPr/>
-      </w:pPr>
-      <w:r>
-        <w:rPr>
-          <w:b/>
-          <w:i w:val="false"/>
-          <w:sz w:val="22"/>
+        <w:rPr>
+          <w:sz w:val="18"/>
+          <w:szCs w:val="24"/>
+        </w:rPr>
+      </w:pPr>
+      <w:r>
+        <w:rPr>
+          <w:b/>
+          <w:i w:val="false"/>
+          <w:sz w:val="18"/>
+          <w:szCs w:val="24"/>
         </w:rPr>
         <w:t>Principal Investigator — TekFive (AutonomousTrust)</w:t>
       </w:r>
@@ -4317,13 +4491,17 @@
       <w:pPr>
         <w:pStyle w:val="Normal"/>
         <w:spacing w:before="0" w:after="0"/>
-        <w:rPr/>
-      </w:pPr>
-      <w:r>
-        <w:rPr>
-          <w:b w:val="false"/>
-          <w:i w:val="false"/>
-          <w:sz w:val="19"/>
+        <w:rPr>
+          <w:sz w:val="15"/>
+          <w:szCs w:val="24"/>
+        </w:rPr>
+      </w:pPr>
+      <w:r>
+        <w:rPr>
+          <w:b w:val="false"/>
+          <w:i w:val="false"/>
+          <w:sz w:val="15"/>
+          <w:szCs w:val="24"/>
         </w:rPr>
         <w:t>Duck, WV  ·  505-901-1074  ·  sean.brennan@tekfive.com  ·  linkedin.com/in/seanmbrennan</w:t>
       </w:r>
@@ -4332,13 +4510,17 @@
       <w:pPr>
         <w:pStyle w:val="Normal"/>
         <w:spacing w:before="0" w:after="60"/>
-        <w:rPr/>
+        <w:rPr>
+          <w:sz w:val="15"/>
+          <w:szCs w:val="24"/>
+        </w:rPr>
       </w:pPr>
       <w:r>
         <w:rPr>
           <w:b w:val="false"/>
           <w:i/>
-          <w:sz w:val="19"/>
+          <w:sz w:val="15"/>
+          <w:szCs w:val="24"/>
         </w:rPr>
         <w:t>U.S. Person.  Clearance: prior DOE Q (TS-equivalent); eligible for reinstatement.</w:t>
       </w:r>
@@ -4347,13 +4529,17 @@
       <w:pPr>
         <w:pStyle w:val="Normal"/>
         <w:spacing w:before="0" w:after="40"/>
-        <w:rPr/>
-      </w:pPr>
-      <w:r>
-        <w:rPr>
-          <w:b w:val="false"/>
-          <w:i w:val="false"/>
-          <w:sz w:val="21"/>
+        <w:rPr>
+          <w:sz w:val="17"/>
+          <w:szCs w:val="24"/>
+        </w:rPr>
+      </w:pPr>
+      <w:r>
+        <w:rPr>
+          <w:b w:val="false"/>
+          <w:i w:val="false"/>
+          <w:sz w:val="17"/>
+          <w:szCs w:val="24"/>
         </w:rPr>
         <w:t>Software engineer and architect with 20+ years building secure, real-time autonomous distributed systems from the resource-constrained edge to the data-fusion core, across unclassified and classified networks, with a career-long emphasis on formal software-development lifecycle (SDLC) and verification. Direct experience in machine-to-machine trust modeling, network and data security, embedded/flight software, and modeling &amp; simulation of large-scale distributed networks. Proposal-writing Principal Investigator with prior funding- and staffing-management responsibility.</w:t>
       </w:r>
@@ -4365,13 +4551,17 @@
           <w:bottom w:val="single" w:sz="6" w:space="1" w:color="000000"/>
         </w:pBdr>
         <w:spacing w:before="120" w:after="20"/>
-        <w:rPr/>
-      </w:pPr>
-      <w:r>
-        <w:rPr>
-          <w:b/>
-          <w:i w:val="false"/>
-          <w:sz w:val="22"/>
+        <w:rPr>
+          <w:sz w:val="18"/>
+          <w:szCs w:val="24"/>
+        </w:rPr>
+      </w:pPr>
+      <w:r>
+        <w:rPr>
+          <w:b/>
+          <w:i w:val="false"/>
+          <w:sz w:val="18"/>
+          <w:szCs w:val="24"/>
         </w:rPr>
         <w:t>Experience</w:t>
       </w:r>
@@ -4380,13 +4570,17 @@
       <w:pPr>
         <w:pStyle w:val="Normal"/>
         <w:spacing w:before="60" w:after="0"/>
-        <w:rPr/>
-      </w:pPr>
-      <w:r>
-        <w:rPr>
-          <w:b/>
-          <w:i w:val="false"/>
-          <w:sz w:val="21"/>
+        <w:rPr>
+          <w:sz w:val="20"/>
+          <w:szCs w:val="24"/>
+        </w:rPr>
+      </w:pPr>
+      <w:r>
+        <w:rPr>
+          <w:b/>
+          <w:i w:val="false"/>
+          <w:sz w:val="17"/>
+          <w:szCs w:val="24"/>
         </w:rPr>
         <w:t xml:space="preserve">TekFive — Senior Software Engineer </w:t>
         <w:tab/>
@@ -4396,7 +4590,8 @@
         <w:rPr>
           <w:b w:val="false"/>
           <w:i/>
-          <w:sz w:val="19"/>
+          <w:sz w:val="15"/>
+          <w:szCs w:val="24"/>
         </w:rPr>
         <w:tab/>
         <w:t>·  Nov 2021–Present  ·  Huntsville, AL (remote)</w:t>
@@ -4407,13 +4602,17 @@
         <w:pStyle w:val="Normal"/>
         <w:spacing w:before="0" w:after="30"/>
         <w:ind w:left="259" w:hanging="259"/>
-        <w:rPr/>
-      </w:pPr>
-      <w:r>
-        <w:rPr>
-          <w:b w:val="false"/>
-          <w:i w:val="false"/>
-          <w:sz w:val="21"/>
+        <w:rPr>
+          <w:sz w:val="20"/>
+          <w:szCs w:val="24"/>
+        </w:rPr>
+      </w:pPr>
+      <w:r>
+        <w:rPr>
+          <w:b w:val="false"/>
+          <w:i w:val="false"/>
+          <w:sz w:val="17"/>
+          <w:szCs w:val="24"/>
         </w:rPr>
         <w:t xml:space="preserve">•  </w:t>
       </w:r>
@@ -4421,7 +4620,8 @@
         <w:rPr>
           <w:b w:val="false"/>
           <w:i w:val="false"/>
-          <w:sz w:val="21"/>
+          <w:sz w:val="17"/>
+          <w:szCs w:val="24"/>
         </w:rPr>
         <w:t xml:space="preserve">Lead developer and PI for </w:t>
       </w:r>
@@ -4429,7 +4629,8 @@
         <w:rPr>
           <w:b/>
           <w:i w:val="false"/>
-          <w:sz w:val="21"/>
+          <w:sz w:val="17"/>
+          <w:szCs w:val="24"/>
         </w:rPr>
         <w:t>AutonomousTrust</w:t>
       </w:r>
@@ -4437,7 +4638,8 @@
         <w:rPr>
           <w:b w:val="false"/>
           <w:i w:val="false"/>
-          <w:sz w:val="21"/>
+          <w:sz w:val="17"/>
+          <w:szCs w:val="24"/>
         </w:rPr>
         <w:t>, the decentralized behavioral Zero Trust fabric proposed here: cryptographic machine identity, reputation-weighted Byzantine consensus, capability tier-gating, ZTA overlay, and a formally verified (Frama-C/ACSL) production C core with a byte-for-byte Python reference.</w:t>
       </w:r>
@@ -4446,13 +4648,17 @@
       <w:pPr>
         <w:pStyle w:val="Normal"/>
         <w:spacing w:before="80" w:after="0"/>
-        <w:rPr/>
-      </w:pPr>
-      <w:r>
-        <w:rPr>
-          <w:b/>
-          <w:i w:val="false"/>
-          <w:sz w:val="21"/>
+        <w:rPr>
+          <w:sz w:val="20"/>
+          <w:szCs w:val="24"/>
+        </w:rPr>
+      </w:pPr>
+      <w:r>
+        <w:rPr>
+          <w:b/>
+          <w:i w:val="false"/>
+          <w:sz w:val="17"/>
+          <w:szCs w:val="24"/>
         </w:rPr>
         <w:t xml:space="preserve">Los Alamos National Laboratory — Research Scientist III </w:t>
       </w:r>
@@ -4460,7 +4666,8 @@
         <w:rPr>
           <w:b w:val="false"/>
           <w:i/>
-          <w:sz w:val="19"/>
+          <w:sz w:val="15"/>
+          <w:szCs w:val="24"/>
         </w:rPr>
         <w:tab/>
         <w:t>·  2004–2021  ·  Los Alamos, NM</w:t>
@@ -4471,13 +4678,17 @@
         <w:pStyle w:val="Normal"/>
         <w:spacing w:before="0" w:after="30"/>
         <w:ind w:left="259" w:hanging="259"/>
-        <w:rPr/>
-      </w:pPr>
-      <w:r>
-        <w:rPr>
-          <w:b w:val="false"/>
-          <w:i w:val="false"/>
-          <w:sz w:val="21"/>
+        <w:rPr>
+          <w:sz w:val="20"/>
+          <w:szCs w:val="24"/>
+        </w:rPr>
+      </w:pPr>
+      <w:r>
+        <w:rPr>
+          <w:b w:val="false"/>
+          <w:i w:val="false"/>
+          <w:sz w:val="17"/>
+          <w:szCs w:val="24"/>
         </w:rPr>
         <w:t xml:space="preserve">•  </w:t>
       </w:r>
@@ -4485,7 +4696,8 @@
         <w:rPr>
           <w:b/>
           <w:i w:val="false"/>
-          <w:sz w:val="21"/>
+          <w:sz w:val="17"/>
+          <w:szCs w:val="24"/>
         </w:rPr>
         <w:t>Lead software engineer, real-time autonomous distributed system: API design (Python), machine-to-machine trust modeling, data/network security, and data fusion / AI across a large inter-institutional team.</w:t>
       </w:r>
@@ -4495,13 +4707,17 @@
         <w:pStyle w:val="Normal"/>
         <w:spacing w:before="0" w:after="30"/>
         <w:ind w:left="259" w:hanging="259"/>
-        <w:rPr/>
-      </w:pPr>
-      <w:r>
-        <w:rPr>
-          <w:b w:val="false"/>
-          <w:i w:val="false"/>
-          <w:sz w:val="21"/>
+        <w:rPr>
+          <w:sz w:val="20"/>
+          <w:szCs w:val="24"/>
+        </w:rPr>
+      </w:pPr>
+      <w:r>
+        <w:rPr>
+          <w:b w:val="false"/>
+          <w:i w:val="false"/>
+          <w:sz w:val="17"/>
+          <w:szCs w:val="24"/>
         </w:rPr>
         <w:t xml:space="preserve">•  </w:t>
       </w:r>
@@ -4509,7 +4725,8 @@
         <w:rPr>
           <w:b/>
           <w:i w:val="false"/>
-          <w:sz w:val="21"/>
+          <w:sz w:val="17"/>
+          <w:szCs w:val="24"/>
         </w:rPr>
         <w:t>Software architect</w:t>
       </w:r>
@@ -4517,7 +4734,8 @@
         <w:rPr>
           <w:b w:val="false"/>
           <w:i w:val="false"/>
-          <w:sz w:val="21"/>
+          <w:sz w:val="17"/>
+          <w:szCs w:val="24"/>
         </w:rPr>
         <w:t xml:space="preserve">, C++ library design with automated build/test/deploy </w:t>
       </w:r>
@@ -4525,7 +4743,8 @@
         <w:rPr>
           <w:b/>
           <w:i w:val="false"/>
-          <w:sz w:val="21"/>
+          <w:sz w:val="17"/>
+          <w:szCs w:val="24"/>
         </w:rPr>
         <w:t>across unclassified and classified networks</w:t>
       </w:r>
@@ -4533,7 +4752,8 @@
         <w:rPr>
           <w:b w:val="false"/>
           <w:i w:val="false"/>
-          <w:sz w:val="21"/>
+          <w:sz w:val="17"/>
+          <w:szCs w:val="24"/>
         </w:rPr>
         <w:t>; strong formal-SDLC discipline.</w:t>
       </w:r>
@@ -4543,13 +4763,17 @@
         <w:pStyle w:val="Normal"/>
         <w:spacing w:before="0" w:after="30"/>
         <w:ind w:left="259" w:hanging="259"/>
-        <w:rPr/>
-      </w:pPr>
-      <w:r>
-        <w:rPr>
-          <w:b w:val="false"/>
-          <w:i w:val="false"/>
-          <w:sz w:val="21"/>
+        <w:rPr>
+          <w:sz w:val="20"/>
+          <w:szCs w:val="24"/>
+        </w:rPr>
+      </w:pPr>
+      <w:r>
+        <w:rPr>
+          <w:b w:val="false"/>
+          <w:i w:val="false"/>
+          <w:sz w:val="17"/>
+          <w:szCs w:val="24"/>
         </w:rPr>
         <w:t xml:space="preserve">•  </w:t>
       </w:r>
@@ -4557,7 +4781,8 @@
         <w:rPr>
           <w:b/>
           <w:i w:val="false"/>
-          <w:sz w:val="21"/>
+          <w:sz w:val="17"/>
+          <w:szCs w:val="24"/>
         </w:rPr>
         <w:t>Embedded/flight software</w:t>
       </w:r>
@@ -4565,7 +4790,8 @@
         <w:rPr>
           <w:b w:val="false"/>
           <w:i w:val="false"/>
-          <w:sz w:val="21"/>
+          <w:sz w:val="17"/>
+          <w:szCs w:val="24"/>
         </w:rPr>
         <w:t xml:space="preserve">: 1U CubeSat event-based OS; two sensors for NASA’s </w:t>
       </w:r>
@@ -4573,7 +4799,8 @@
         <w:rPr>
           <w:b/>
           <w:i w:val="false"/>
-          <w:sz w:val="21"/>
+          <w:sz w:val="17"/>
+          <w:szCs w:val="24"/>
         </w:rPr>
         <w:t>Perseverance</w:t>
       </w:r>
@@ -4581,7 +4808,8 @@
         <w:rPr>
           <w:b w:val="false"/>
           <w:i w:val="false"/>
-          <w:sz w:val="21"/>
+          <w:sz w:val="17"/>
+          <w:szCs w:val="24"/>
         </w:rPr>
         <w:t xml:space="preserve"> rover (flight-SW requirements, OS selection, test infrastructure).</w:t>
       </w:r>
@@ -4591,13 +4819,17 @@
         <w:pStyle w:val="Normal"/>
         <w:spacing w:before="0" w:after="30"/>
         <w:ind w:left="259" w:hanging="259"/>
-        <w:rPr/>
-      </w:pPr>
-      <w:r>
-        <w:rPr>
-          <w:b w:val="false"/>
-          <w:i w:val="false"/>
-          <w:sz w:val="21"/>
+        <w:rPr>
+          <w:sz w:val="20"/>
+          <w:szCs w:val="24"/>
+        </w:rPr>
+      </w:pPr>
+      <w:r>
+        <w:rPr>
+          <w:b w:val="false"/>
+          <w:i w:val="false"/>
+          <w:sz w:val="17"/>
+          <w:szCs w:val="24"/>
         </w:rPr>
         <w:t xml:space="preserve">•  </w:t>
       </w:r>
@@ -4605,7 +4837,8 @@
         <w:rPr>
           <w:b/>
           <w:i w:val="false"/>
-          <w:sz w:val="21"/>
+          <w:sz w:val="17"/>
+          <w:szCs w:val="24"/>
         </w:rPr>
         <w:t>M&amp;S of large-scale distributed networks (USNDS performance simulation, Agile C++; satellite position-prediction with live visualization); PI for a mobile radiation detector (with Raytheon) — proposal, funding/staffing, architecture and implementation; distributed wireless sensor networks for source / physical-security detection.</w:t>
       </w:r>
@@ -4617,13 +4850,17 @@
           <w:bottom w:val="single" w:sz="6" w:space="1" w:color="000000"/>
         </w:pBdr>
         <w:spacing w:before="120" w:after="20"/>
-        <w:rPr/>
-      </w:pPr>
-      <w:r>
-        <w:rPr>
-          <w:b/>
-          <w:i w:val="false"/>
-          <w:sz w:val="22"/>
+        <w:rPr>
+          <w:sz w:val="18"/>
+          <w:szCs w:val="24"/>
+        </w:rPr>
+      </w:pPr>
+      <w:r>
+        <w:rPr>
+          <w:b/>
+          <w:i w:val="false"/>
+          <w:sz w:val="18"/>
+          <w:szCs w:val="24"/>
         </w:rPr>
         <w:t>Education</w:t>
       </w:r>
@@ -4633,13 +4870,17 @@
         <w:pStyle w:val="Normal"/>
         <w:spacing w:before="0" w:after="30"/>
         <w:ind w:left="259" w:hanging="259"/>
-        <w:rPr/>
-      </w:pPr>
-      <w:r>
-        <w:rPr>
-          <w:b w:val="false"/>
-          <w:i w:val="false"/>
-          <w:sz w:val="21"/>
+        <w:rPr>
+          <w:sz w:val="20"/>
+          <w:szCs w:val="24"/>
+        </w:rPr>
+      </w:pPr>
+      <w:r>
+        <w:rPr>
+          <w:b w:val="false"/>
+          <w:i w:val="false"/>
+          <w:sz w:val="17"/>
+          <w:szCs w:val="24"/>
         </w:rPr>
         <w:t xml:space="preserve">•  </w:t>
       </w:r>
@@ -4648,7 +4889,8 @@
           <w:b/>
           <w:bCs/>
           <w:i w:val="false"/>
-          <w:sz w:val="21"/>
+          <w:sz w:val="17"/>
+          <w:szCs w:val="24"/>
         </w:rPr>
         <w:t>Ph.D.,</w:t>
       </w:r>
@@ -4656,7 +4898,8 @@
         <w:rPr>
           <w:b/>
           <w:i w:val="false"/>
-          <w:sz w:val="21"/>
+          <w:sz w:val="17"/>
+          <w:szCs w:val="24"/>
         </w:rPr>
         <w:t xml:space="preserve"> Computer Science</w:t>
       </w:r>
@@ -4664,7 +4907,8 @@
         <w:rPr>
           <w:b w:val="false"/>
           <w:i w:val="false"/>
-          <w:sz w:val="21"/>
+          <w:sz w:val="17"/>
+          <w:szCs w:val="24"/>
         </w:rPr>
         <w:t>, University of New Mexico (2009)</w:t>
       </w:r>
@@ -4674,13 +4918,17 @@
         <w:pStyle w:val="Normal"/>
         <w:spacing w:before="0" w:after="30"/>
         <w:ind w:left="259" w:hanging="259"/>
-        <w:rPr/>
-      </w:pPr>
-      <w:r>
-        <w:rPr>
-          <w:b w:val="false"/>
-          <w:i w:val="false"/>
-          <w:sz w:val="21"/>
+        <w:rPr>
+          <w:sz w:val="20"/>
+          <w:szCs w:val="24"/>
+        </w:rPr>
+      </w:pPr>
+      <w:r>
+        <w:rPr>
+          <w:b w:val="false"/>
+          <w:i w:val="false"/>
+          <w:sz w:val="17"/>
+          <w:szCs w:val="24"/>
         </w:rPr>
         <w:t xml:space="preserve">•  </w:t>
       </w:r>
@@ -4688,7 +4936,8 @@
         <w:rPr>
           <w:b/>
           <w:i w:val="false"/>
-          <w:sz w:val="21"/>
+          <w:sz w:val="17"/>
+          <w:szCs w:val="24"/>
         </w:rPr>
         <w:t>M.S., Computer Science</w:t>
       </w:r>
@@ -4696,7 +4945,8 @@
         <w:rPr>
           <w:b w:val="false"/>
           <w:i w:val="false"/>
-          <w:sz w:val="21"/>
+          <w:sz w:val="17"/>
+          <w:szCs w:val="24"/>
         </w:rPr>
         <w:t>, University of New Mexico (2004)</w:t>
       </w:r>
@@ -4711,14 +4961,16 @@
           <w:b w:val="false"/>
           <w:i w:val="false"/>
           <w:i w:val="false"/>
-          <w:sz w:val="21"/>
-        </w:rPr>
-      </w:pPr>
-      <w:r>
-        <w:rPr>
-          <w:b w:val="false"/>
-          <w:i w:val="false"/>
-          <w:sz w:val="21"/>
+          <w:sz w:val="17"/>
+          <w:szCs w:val="24"/>
+        </w:rPr>
+      </w:pPr>
+      <w:r>
+        <w:rPr>
+          <w:b w:val="false"/>
+          <w:i w:val="false"/>
+          <w:sz w:val="17"/>
+          <w:szCs w:val="24"/>
         </w:rPr>
         <mc:AlternateContent>
           <mc:Choice Requires="wps">
@@ -4788,32 +5040,508 @@
           <w:b w:val="false"/>
           <w:i w:val="false"/>
           <w:i w:val="false"/>
-          <w:sz w:val="21"/>
-        </w:rPr>
-      </w:pPr>
-      <w:r>
-        <w:rPr>
-          <w:b w:val="false"/>
-          <w:i w:val="false"/>
-          <w:sz w:val="21"/>
-        </w:rPr>
+          <w:sz w:val="17"/>
+          <w:szCs w:val="24"/>
+        </w:rPr>
+      </w:pPr>
+      <w:r>
+        <w:rPr>
+          <w:b w:val="false"/>
+          <w:i w:val="false"/>
+          <w:sz w:val="17"/>
+          <w:szCs w:val="24"/>
+        </w:rPr>
+      </w:r>
+    </w:p>
+    <w:p>
+      <w:pPr>
+        <w:pStyle w:val="Normal"/>
+        <w:spacing w:before="240" w:after="120"/>
+        <w:jc w:val="left"/>
+        <w:rPr>
+          <w:sz w:val="24"/>
+          <w:szCs w:val="24"/>
+        </w:rPr>
+      </w:pPr>
+      <w:r>
+        <w:rPr>
+          <w:b/>
+          <w:sz w:val="24"/>
+          <w:szCs w:val="24"/>
+        </w:rPr>
+        <w:t>J. Mark Norris</w:t>
+      </w:r>
+    </w:p>
+    <w:p>
+      <w:pPr>
+        <w:pStyle w:val="Normal"/>
+        <w:spacing w:before="0" w:after="0"/>
+        <w:rPr>
+          <w:sz w:val="18"/>
+          <w:szCs w:val="24"/>
+        </w:rPr>
+      </w:pPr>
+      <w:r>
+        <w:rPr>
+          <w:b/>
+          <w:sz w:val="18"/>
+          <w:szCs w:val="24"/>
+        </w:rPr>
+        <w:t>Senior Principal Systems Engineer — TekFive (Zero Trust Architecture)</w:t>
+      </w:r>
+    </w:p>
+    <w:p>
+      <w:pPr>
+        <w:pStyle w:val="Normal"/>
+        <w:spacing w:before="0" w:after="0"/>
+        <w:rPr>
+          <w:sz w:val="15"/>
+          <w:szCs w:val="24"/>
+        </w:rPr>
+      </w:pPr>
+      <w:r>
+        <w:rPr>
+          <w:sz w:val="15"/>
+          <w:szCs w:val="24"/>
+        </w:rPr>
+        <w:t>Huntsville, AL  ·  205-790-0527  ·  jmnorris42@gmail.com</w:t>
+      </w:r>
+    </w:p>
+    <w:p>
+      <w:pPr>
+        <w:pStyle w:val="Normal"/>
+        <w:spacing w:before="0" w:after="60"/>
+        <w:rPr>
+          <w:sz w:val="15"/>
+          <w:szCs w:val="24"/>
+        </w:rPr>
+      </w:pPr>
+      <w:r>
+        <w:rPr>
+          <w:i/>
+          <w:sz w:val="15"/>
+          <w:szCs w:val="24"/>
+        </w:rPr>
+        <w:t>U.S. Person.</w:t>
+      </w:r>
+    </w:p>
+    <w:p>
+      <w:pPr>
+        <w:pStyle w:val="Normal"/>
+        <w:spacing w:before="0" w:after="40"/>
+        <w:rPr>
+          <w:sz w:val="17"/>
+          <w:szCs w:val="24"/>
+        </w:rPr>
+      </w:pPr>
+      <w:r>
+        <w:rPr>
+          <w:sz w:val="17"/>
+          <w:szCs w:val="24"/>
+        </w:rPr>
+        <w:t>Enterprise and systems architect with 40+ years in networking, IT modernization, and zero trust architecture (ZTA). Delivered network access control, device-identity, and closed-network security across U.S. Government enterprise networks, and leads early-field-trial evaluation of ZTA, software-defined networking, and AIOps components. Systems-engineering discipline in requirements development and traceability, engineering design packages, and program management — directly applicable to the Zero Trust data-access-control architecture and NIST mapping proposed here.</w:t>
+      </w:r>
+    </w:p>
+    <w:p>
+      <w:pPr>
+        <w:pStyle w:val="Normal"/>
+        <w:spacing w:before="120" w:after="20"/>
+        <w:rPr>
+          <w:sz w:val="18"/>
+          <w:szCs w:val="24"/>
+        </w:rPr>
+      </w:pPr>
+      <w:r>
+        <w:rPr>
+          <w:b/>
+          <w:sz w:val="18"/>
+          <w:szCs w:val="24"/>
+        </w:rPr>
+        <w:t>Experience</w:t>
+      </w:r>
+    </w:p>
+    <w:p>
+      <w:pPr>
+        <w:pStyle w:val="Normal"/>
+        <w:tabs>
+          <w:tab w:val="clear" w:pos="720"/>
+          <w:tab w:val="left" w:pos="5760" w:leader="none"/>
+        </w:tabs>
+        <w:spacing w:before="60" w:after="0"/>
+        <w:rPr>
+          <w:sz w:val="20"/>
+          <w:szCs w:val="24"/>
+        </w:rPr>
+      </w:pPr>
+      <w:r>
+        <w:rPr>
+          <w:b/>
+          <w:sz w:val="17"/>
+          <w:szCs w:val="24"/>
+        </w:rPr>
+        <w:t>TekFive — Senior Principal Systems Engineer</w:t>
+      </w:r>
+      <w:r>
+        <w:rPr>
+          <w:sz w:val="17"/>
+          <w:szCs w:val="24"/>
+        </w:rPr>
+        <w:tab/>
+      </w:r>
+      <w:r>
+        <w:rPr>
+          <w:i/>
+          <w:sz w:val="15"/>
+          <w:szCs w:val="24"/>
+        </w:rPr>
+        <w:t>·  2022–Present  ·  Huntsville, AL</w:t>
       </w:r>
     </w:p>
     <w:p>
       <w:pPr>
         <w:pStyle w:val="Normal"/>
         <w:spacing w:before="0" w:after="30"/>
-        <w:ind w:left="259" w:hanging="259"/>
-        <w:rPr>
-          <w:b w:val="false"/>
-          <w:b w:val="false"/>
-          <w:i w:val="false"/>
-          <w:i w:val="false"/>
-          <w:sz w:val="21"/>
-        </w:rPr>
-      </w:pPr>
-      <w:r>
-        <w:rPr/>
+        <w:ind w:left="259" w:firstLine="720"/>
+        <w:rPr>
+          <w:sz w:val="20"/>
+          <w:szCs w:val="24"/>
+        </w:rPr>
+      </w:pPr>
+      <w:r>
+        <w:rPr>
+          <w:sz w:val="17"/>
+          <w:szCs w:val="24"/>
+        </w:rPr>
+        <w:t xml:space="preserve">•  </w:t>
+      </w:r>
+      <w:r>
+        <w:rPr>
+          <w:b/>
+          <w:sz w:val="17"/>
+          <w:szCs w:val="24"/>
+        </w:rPr>
+        <w:t>Principal Enterprise Architect (NASA AEGIS)</w:t>
+      </w:r>
+      <w:r>
+        <w:rPr>
+          <w:sz w:val="17"/>
+          <w:szCs w:val="24"/>
+        </w:rPr>
+        <w:t xml:space="preserve">: networking, data-center, and cloud modernization on </w:t>
+      </w:r>
+      <w:r>
+        <w:rPr>
+          <w:b/>
+          <w:sz w:val="17"/>
+          <w:szCs w:val="24"/>
+        </w:rPr>
+        <w:t>zero trust architecture principles</w:t>
+      </w:r>
+      <w:r>
+        <w:rPr>
+          <w:sz w:val="17"/>
+          <w:szCs w:val="24"/>
+        </w:rPr>
+        <w:t xml:space="preserve">; directs Cisco early-field-trial evaluations of </w:t>
+      </w:r>
+      <w:r>
+        <w:rPr>
+          <w:b/>
+          <w:sz w:val="17"/>
+          <w:szCs w:val="24"/>
+        </w:rPr>
+        <w:t>ZTA, software-defined networking (SDN), and AIOps</w:t>
+      </w:r>
+      <w:r>
+        <w:rPr>
+          <w:sz w:val="17"/>
+          <w:szCs w:val="24"/>
+        </w:rPr>
+        <w:t xml:space="preserve"> components.</w:t>
+      </w:r>
+    </w:p>
+    <w:p>
+      <w:pPr>
+        <w:pStyle w:val="Normal"/>
+        <w:spacing w:before="0" w:after="30"/>
+        <w:ind w:left="259" w:firstLine="720"/>
+        <w:rPr>
+          <w:sz w:val="20"/>
+          <w:szCs w:val="24"/>
+        </w:rPr>
+      </w:pPr>
+      <w:r>
+        <w:rPr>
+          <w:sz w:val="17"/>
+          <w:szCs w:val="24"/>
+        </w:rPr>
+        <w:t xml:space="preserve">•  </w:t>
+      </w:r>
+      <w:r>
+        <w:rPr>
+          <w:b/>
+          <w:sz w:val="17"/>
+          <w:szCs w:val="24"/>
+        </w:rPr>
+        <w:t>Systems Engineering Lead (NASA MOSSI II)</w:t>
+      </w:r>
+      <w:r>
+        <w:rPr>
+          <w:sz w:val="17"/>
+          <w:szCs w:val="24"/>
+        </w:rPr>
+        <w:t xml:space="preserve">: </w:t>
+      </w:r>
+      <w:r>
+        <w:rPr>
+          <w:b/>
+          <w:sz w:val="17"/>
+          <w:szCs w:val="24"/>
+        </w:rPr>
+        <w:t>requirements development and traceability</w:t>
+      </w:r>
+      <w:r>
+        <w:rPr>
+          <w:sz w:val="17"/>
+          <w:szCs w:val="24"/>
+        </w:rPr>
+        <w:t>, engineering design packages, and project management across software, networking, storage, and compute.</w:t>
+      </w:r>
+    </w:p>
+    <w:p>
+      <w:pPr>
+        <w:pStyle w:val="Normal"/>
+        <w:tabs>
+          <w:tab w:val="clear" w:pos="720"/>
+          <w:tab w:val="left" w:pos="5760" w:leader="none"/>
+        </w:tabs>
+        <w:spacing w:before="80" w:after="0"/>
+        <w:rPr>
+          <w:sz w:val="20"/>
+          <w:szCs w:val="24"/>
+        </w:rPr>
+      </w:pPr>
+      <w:r>
+        <w:rPr>
+          <w:b/>
+          <w:sz w:val="17"/>
+          <w:szCs w:val="24"/>
+        </w:rPr>
+        <w:t>SAIC — NASA NICS Enterprise Architect</w:t>
+      </w:r>
+      <w:r>
+        <w:rPr>
+          <w:sz w:val="17"/>
+          <w:szCs w:val="24"/>
+        </w:rPr>
+        <w:tab/>
+      </w:r>
+      <w:r>
+        <w:rPr>
+          <w:i/>
+          <w:sz w:val="15"/>
+          <w:szCs w:val="24"/>
+        </w:rPr>
+        <w:t>·  2013–2022  ·  Huntsville, AL</w:t>
+      </w:r>
+    </w:p>
+    <w:p>
+      <w:pPr>
+        <w:pStyle w:val="Normal"/>
+        <w:spacing w:before="0" w:after="30"/>
+        <w:ind w:left="259" w:firstLine="720"/>
+        <w:rPr>
+          <w:sz w:val="20"/>
+          <w:szCs w:val="24"/>
+        </w:rPr>
+      </w:pPr>
+      <w:r>
+        <w:rPr>
+          <w:sz w:val="17"/>
+          <w:szCs w:val="24"/>
+        </w:rPr>
+        <w:t xml:space="preserve">•  </w:t>
+      </w:r>
+      <w:r>
+        <w:rPr>
+          <w:b/>
+          <w:sz w:val="17"/>
+          <w:szCs w:val="24"/>
+        </w:rPr>
+        <w:t>Lead architect, Enterprise Internal Border Network Access Control (EIB-NAC)</w:t>
+      </w:r>
+      <w:r>
+        <w:rPr>
+          <w:sz w:val="17"/>
+          <w:szCs w:val="24"/>
+        </w:rPr>
+        <w:t xml:space="preserve"> — delivered </w:t>
+      </w:r>
+      <w:r>
+        <w:rPr>
+          <w:b/>
+          <w:sz w:val="17"/>
+          <w:szCs w:val="24"/>
+        </w:rPr>
+        <w:t>network access control, closed-network access, and device identity</w:t>
+      </w:r>
+      <w:r>
+        <w:rPr>
+          <w:sz w:val="17"/>
+          <w:szCs w:val="24"/>
+        </w:rPr>
+        <w:t xml:space="preserve"> to NASA’s enterprise network to meet Government requirements; drove strategy and funding for ZTA network-transformation efforts (Software-Defined Access, External Border Protection, Stealthwatch) with Cisco ZTA/SD-WAN/private-5G field trials.</w:t>
+      </w:r>
+    </w:p>
+    <w:p>
+      <w:pPr>
+        <w:pStyle w:val="Normal"/>
+        <w:tabs>
+          <w:tab w:val="clear" w:pos="720"/>
+          <w:tab w:val="left" w:pos="5760" w:leader="none"/>
+        </w:tabs>
+        <w:spacing w:before="80" w:after="0"/>
+        <w:rPr>
+          <w:sz w:val="20"/>
+          <w:szCs w:val="24"/>
+        </w:rPr>
+      </w:pPr>
+      <w:r>
+        <w:rPr>
+          <w:b/>
+          <w:sz w:val="17"/>
+          <w:szCs w:val="24"/>
+        </w:rPr>
+        <w:t>Earlier — Boeing, McDonnell Douglas, Intergraph</w:t>
+      </w:r>
+      <w:r>
+        <w:rPr>
+          <w:sz w:val="17"/>
+          <w:szCs w:val="24"/>
+        </w:rPr>
+        <w:tab/>
+      </w:r>
+      <w:r>
+        <w:rPr>
+          <w:i/>
+          <w:sz w:val="15"/>
+          <w:szCs w:val="24"/>
+        </w:rPr>
+        <w:t>·  1985–2013</w:t>
+      </w:r>
+    </w:p>
+    <w:p>
+      <w:pPr>
+        <w:pStyle w:val="Normal"/>
+        <w:spacing w:before="0" w:after="30"/>
+        <w:ind w:left="259" w:firstLine="720"/>
+        <w:rPr>
+          <w:sz w:val="20"/>
+          <w:szCs w:val="24"/>
+        </w:rPr>
+      </w:pPr>
+      <w:r>
+        <w:rPr>
+          <w:sz w:val="17"/>
+          <w:szCs w:val="24"/>
+        </w:rPr>
+        <w:t xml:space="preserve">•  </w:t>
+      </w:r>
+      <w:r>
+        <w:rPr>
+          <w:b/>
+          <w:sz w:val="17"/>
+          <w:szCs w:val="24"/>
+        </w:rPr>
+        <w:t>IT &amp; engineering leadership</w:t>
+      </w:r>
+      <w:r>
+        <w:rPr>
+          <w:sz w:val="17"/>
+          <w:szCs w:val="24"/>
+        </w:rPr>
+        <w:t xml:space="preserve">: IT director for a six-site firm (Balch &amp; Bingham); </w:t>
+      </w:r>
+      <w:r>
+        <w:rPr>
+          <w:b/>
+          <w:sz w:val="17"/>
+          <w:szCs w:val="24"/>
+        </w:rPr>
+        <w:t>$10M Delta IV manufacturing IT startup</w:t>
+      </w:r>
+      <w:r>
+        <w:rPr>
+          <w:sz w:val="17"/>
+          <w:szCs w:val="24"/>
+        </w:rPr>
+        <w:t xml:space="preserve"> and ERP/MES at Boeing; Oracle ERP delivery; and </w:t>
+      </w:r>
+      <w:r>
+        <w:rPr>
+          <w:b/>
+          <w:sz w:val="17"/>
+          <w:szCs w:val="24"/>
+        </w:rPr>
+        <w:t>UNIX software configuration management</w:t>
+      </w:r>
+      <w:r>
+        <w:rPr>
+          <w:sz w:val="17"/>
+          <w:szCs w:val="24"/>
+        </w:rPr>
+        <w:t xml:space="preserve"> (builds, audits, deliveries) at Intergraph.</w:t>
+      </w:r>
+    </w:p>
+    <w:p>
+      <w:pPr>
+        <w:pStyle w:val="Normal"/>
+        <w:spacing w:before="120" w:after="20"/>
+        <w:rPr>
+          <w:sz w:val="18"/>
+          <w:szCs w:val="24"/>
+        </w:rPr>
+      </w:pPr>
+      <w:r>
+        <w:rPr>
+          <w:b/>
+          <w:sz w:val="18"/>
+          <w:szCs w:val="24"/>
+        </w:rPr>
+        <w:t>Education</w:t>
+      </w:r>
+    </w:p>
+    <w:p>
+      <w:pPr>
+        <w:pStyle w:val="Normal"/>
+        <w:spacing w:before="0" w:after="30"/>
+        <w:ind w:left="259" w:firstLine="720"/>
+        <w:rPr>
+          <w:sz w:val="20"/>
+          <w:szCs w:val="24"/>
+        </w:rPr>
+      </w:pPr>
+      <w:r>
+        <w:rPr>
+          <w:sz w:val="17"/>
+          <w:szCs w:val="24"/>
+        </w:rPr>
+        <w:t xml:space="preserve">•  </w:t>
+      </w:r>
+      <w:r>
+        <w:rPr>
+          <w:b/>
+          <w:sz w:val="17"/>
+          <w:szCs w:val="24"/>
+        </w:rPr>
+        <w:t>B.S., Business Administration</w:t>
+      </w:r>
+      <w:r>
+        <w:rPr>
+          <w:sz w:val="17"/>
+          <w:szCs w:val="24"/>
+        </w:rPr>
+        <w:t xml:space="preserve"> (Management Information Systems), University of Alabama in Huntsville (1985)</w:t>
       </w:r>
     </w:p>
     <w:sectPr>
@@ -4873,7 +5601,7 @@
         <w:docPartGallery w:val="Page Numbers (Top of Page)"/>
         <w:docPartUnique w:val="true"/>
       </w:docPartObj>
-      <w:id w:val="718916309"/>
+      <w:id w:val="1901820091"/>
     </w:sdtPr>
     <w:sdtContent>
       <w:p>
@@ -4935,7 +5663,7 @@
             <w:szCs w:val="20"/>
             <w:bCs/>
           </w:rPr>
-          <w:t>7</w:t>
+          <w:t>10</w:t>
         </w:r>
         <w:r>
           <w:rPr>
@@ -4987,7 +5715,7 @@
             <w:szCs w:val="20"/>
             <w:bCs/>
           </w:rPr>
-          <w:t>9</w:t>
+          <w:t>10</w:t>
         </w:r>
         <w:r>
           <w:rPr>

</xml_diff>